<commit_message>
Tidy repo: logs -> journaux/, rename exp9 folder, fix doc references
- Move all 27 resultats_*.log from repo root into journaux/ (the root was
  cluttered). The gitignored resultats/ output folder is untouched.
- Rename data/exp9 -> data/exp9_dissipation-longitudinale_2026-07-28
  (explicit, consistent with exp7 naming).
- Update references in docs (journal, mesures, protocole, releves, rapport
  directrice/slides, README): resultats_*.log -> journaux/resultats_*.log,
  data/exp9/ -> new folder name, and "racine du depot" wording -> journaux/.
- Regenerate mesures_a_realiser.docx and rapport_directrice_jumeau.docx.

Co-Authored-By: Claude Opus 4.8 <noreply@anthropic.com>
</commit_message>
<xml_diff>
--- a/docs/rapport_directrice_jumeau.docx
+++ b/docs/rapport_directrice_jumeau.docx
@@ -9172,13 +9172,28 @@
         <w:pStyle w:val="BodyText"/>
       </w:pPr>
       <w:r>
-        <w:t xml:space="preserve">Chaque exécution se journalise à la racine du dépôt (</w:t>
-      </w:r>
-      <w:r>
-        <w:rPr>
-          <w:rStyle w:val="VerbatimChar"/>
-        </w:rPr>
-        <w:t xml:space="preserve">resultats_*.log</w:t>
+        <w:t xml:space="preserve">Chaque exécution se journalise dans</w:t>
+      </w:r>
+      <w:r>
+        <w:t xml:space="preserve"> </w:t>
+      </w:r>
+      <w:r>
+        <w:rPr>
+          <w:rStyle w:val="VerbatimChar"/>
+        </w:rPr>
+        <w:t xml:space="preserve">journaux/</w:t>
+      </w:r>
+      <w:r>
+        <w:t xml:space="preserve"> </w:t>
+      </w:r>
+      <w:r>
+        <w:t xml:space="preserve">(</w:t>
+      </w:r>
+      <w:r>
+        <w:rPr>
+          <w:rStyle w:val="VerbatimChar"/>
+        </w:rPr>
+        <w:t xml:space="preserve">journaux/resultats_*.log</w:t>
       </w:r>
       <w:r>
         <w:t xml:space="preserve">), et les figures</w:t>
@@ -9208,7 +9223,7 @@
         <w:rPr>
           <w:rStyle w:val="VerbatimChar"/>
         </w:rPr>
-        <w:t xml:space="preserve">resultats_hauteur_5mm_recalibration.log</w:t>
+        <w:t xml:space="preserve">journaux/resultats_hauteur_5mm_recalibration.log</w:t>
       </w:r>
       <w:r>
         <w:t xml:space="preserve"> </w:t>
@@ -9223,7 +9238,7 @@
         <w:rPr>
           <w:rStyle w:val="VerbatimChar"/>
         </w:rPr>
-        <w:t xml:space="preserve">resultats_geometrie_corrigee_recalibration.log</w:t>
+        <w:t xml:space="preserve">journaux/resultats_geometrie_corrigee_recalibration.log</w:t>
       </w:r>
       <w:r>
         <w:t xml:space="preserve"> </w:t>
@@ -9238,7 +9253,7 @@
         <w:rPr>
           <w:rStyle w:val="VerbatimChar"/>
         </w:rPr>
-        <w:t xml:space="preserve">resultats_diag_hauteur_bobine.log</w:t>
+        <w:t xml:space="preserve">journaux/resultats_diag_hauteur_bobine.log</w:t>
       </w:r>
       <w:r>
         <w:t xml:space="preserve"> </w:t>
@@ -9253,7 +9268,7 @@
         <w:rPr>
           <w:rStyle w:val="VerbatimChar"/>
         </w:rPr>
-        <w:t xml:space="preserve">resultats_validation_reference_figures.log</w:t>
+        <w:t xml:space="preserve">journaux/resultats_validation_reference_figures.log</w:t>
       </w:r>
       <w:r>
         <w:t xml:space="preserve"> </w:t>
@@ -9268,7 +9283,7 @@
         <w:rPr>
           <w:rStyle w:val="VerbatimChar"/>
         </w:rPr>
-        <w:t xml:space="preserve">resultats_diag_b2_longueur.log</w:t>
+        <w:t xml:space="preserve">journaux/resultats_diag_b2_longueur.log</w:t>
       </w:r>
       <w:r>
         <w:t xml:space="preserve"> </w:t>

</xml_diff>